<commit_message>
docs(fase1) subida entregable individuales de Nicolas Barraza
</commit_message>
<xml_diff>
--- a/Fase 1/Nicolas_Barraza_1.1_APT122_AutoevaluacionCompetenciasFase1.docx
+++ b/Fase 1/Nicolas_Barraza_1.1_APT122_AutoevaluacionCompetenciasFase1.docx
@@ -116,8 +116,18 @@
           <w:sz w:val="24"/>
           <w:szCs w:val="24"/>
         </w:rPr>
-        <w:t>El objetivo de esta pauta de autoevaluación es que identifiques tus niveles de logro en las competencias de tu plan de estudio para que, a partir de tus fortalezas y oportunidades de mejora, puedas definir mejor tu proyecto APT. Esta pauta de autoevaluación es un complemento de las reflexiones iniciales de APT que también te ayudarán a definir tu Proyecto APT.</w:t>
+        <w:t>El objetivo de esta pauta de autoevaluación es que identifiques tus niveles de logro en las competencias de tu plan de estudio para que, a partir de tus fortalezas y oportunidades de mejora, puedas definir mejor tu proyecto APT. Esta pauta de autoevaluación es un complemento de las reflexiones iniciales de APT que también te ayu</w:t>
       </w:r>
+      <w:r>
+        <w:rPr>
+          <w:rFonts w:eastAsiaTheme="majorEastAsia"/>
+          <w:sz w:val="24"/>
+          <w:szCs w:val="24"/>
+        </w:rPr>
+        <w:t>darán a definir tu Proyecto APT</w:t>
+      </w:r>
+      <w:bookmarkStart w:id="1" w:name="_GoBack"/>
+      <w:bookmarkEnd w:id="1"/>
     </w:p>
     <w:p>
       <w:pPr>
@@ -935,8 +945,6 @@
               </w:rPr>
               <w:t>2023</w:t>
             </w:r>
-            <w:bookmarkStart w:id="1" w:name="_GoBack"/>
-            <w:bookmarkEnd w:id="1"/>
           </w:p>
         </w:tc>
       </w:tr>
@@ -1268,13 +1276,7 @@
               <w:rPr>
                 <w:sz w:val="17"/>
               </w:rPr>
-              <w:t xml:space="preserve">Diseñar </w:t>
-            </w:r>
-            <w:r>
-              <w:rPr>
-                <w:sz w:val="17"/>
-              </w:rPr>
-              <w:t>pruebas de validación de productos y procesos usando buenas prácticas.</w:t>
+              <w:t>Diseñar pruebas de validación de productos y procesos usando buenas prácticas.</w:t>
             </w:r>
           </w:p>
         </w:tc>
@@ -1350,13 +1352,7 @@
               <w:rPr>
                 <w:sz w:val="17"/>
               </w:rPr>
-              <w:t xml:space="preserve">Aplicar pruebas de </w:t>
-            </w:r>
-            <w:r>
-              <w:rPr>
-                <w:sz w:val="17"/>
-              </w:rPr>
-              <w:t>validación a productos y procesos usando buenas prácticas.</w:t>
+              <w:t>Aplicar pruebas de validación a productos y procesos usando buenas prácticas.</w:t>
             </w:r>
           </w:p>
         </w:tc>
@@ -1432,13 +1428,7 @@
               <w:rPr>
                 <w:sz w:val="17"/>
               </w:rPr>
-              <w:t xml:space="preserve">Desarrollar mejoras al producto a partir de los </w:t>
-            </w:r>
-            <w:r>
-              <w:rPr>
-                <w:sz w:val="17"/>
-              </w:rPr>
-              <w:t>resultados de las pruebas.</w:t>
+              <w:t>Desarrollar mejoras al producto a partir de los resultados de las pruebas.</w:t>
             </w:r>
           </w:p>
         </w:tc>
@@ -1514,13 +1504,7 @@
               <w:rPr>
                 <w:sz w:val="17"/>
               </w:rPr>
-              <w:t xml:space="preserve">Planificar proyectos informáticos según los requerimientos de una </w:t>
-            </w:r>
-            <w:r>
-              <w:rPr>
-                <w:sz w:val="17"/>
-              </w:rPr>
-              <w:t>organización.</w:t>
+              <w:t>Planificar proyectos informáticos según los requerimientos de una organización.</w:t>
             </w:r>
           </w:p>
         </w:tc>
@@ -1652,13 +1636,7 @@
               <w:rPr>
                 <w:sz w:val="17"/>
               </w:rPr>
-              <w:t xml:space="preserve">Tengo conocimientos </w:t>
-            </w:r>
-            <w:r>
-              <w:rPr>
-                <w:sz w:val="17"/>
-              </w:rPr>
-              <w:t>básicos de seguimiento de tareas y metodologías de trabajo, pero necesito practicar más el control de avances y riesgos.</w:t>
+              <w:t>Tengo conocimientos básicos de seguimiento de tareas y metodologías de trabajo, pero necesito practicar más el control de avances y riesgos.</w:t>
             </w:r>
           </w:p>
         </w:tc>
@@ -1734,13 +1712,7 @@
               <w:rPr>
                 <w:sz w:val="17"/>
               </w:rPr>
-              <w:t xml:space="preserve">Tengo conocimientos de bases de datos y diseño, pero </w:t>
-            </w:r>
-            <w:r>
-              <w:rPr>
-                <w:sz w:val="17"/>
-              </w:rPr>
-              <w:t>necesito reforzar el modelamiento y la justificación de las decisiones de diseño.</w:t>
+              <w:t>Tengo conocimientos de bases de datos y diseño, pero necesito reforzar el modelamiento y la justificación de las decisiones de diseño.</w:t>
             </w:r>
           </w:p>
         </w:tc>
@@ -1816,13 +1788,7 @@
               <w:rPr>
                 <w:sz w:val="17"/>
               </w:rPr>
-              <w:t xml:space="preserve">He trabajado con consultas y herramientas de bases de datos en actividades académicas, aunque debo </w:t>
-            </w:r>
-            <w:r>
-              <w:rPr>
-                <w:sz w:val="17"/>
-              </w:rPr>
-              <w:t>seguir practicando implementación y validación.</w:t>
+              <w:t>He trabajado con consultas y herramientas de bases de datos en actividades académicas, aunque debo seguir practicando implementación y validación.</w:t>
             </w:r>
           </w:p>
         </w:tc>
@@ -1898,13 +1864,7 @@
               <w:rPr>
                 <w:sz w:val="17"/>
               </w:rPr>
-              <w:t xml:space="preserve">He desarrollado trabajos académicos de programación y aplicaciones, pero debo fortalecer la estructura del código, la </w:t>
-            </w:r>
-            <w:r>
-              <w:rPr>
-                <w:sz w:val="17"/>
-              </w:rPr>
-              <w:t>integración de componentes y las pruebas.</w:t>
+              <w:t>He desarrollado trabajos académicos de programación y aplicaciones, pero debo fortalecer la estructura del código, la integración de componentes y las pruebas.</w:t>
             </w:r>
           </w:p>
         </w:tc>
@@ -9084,534 +9044,6 @@
 </w:styles>
 </file>
 
-<file path=word/glossary/document.xml><?xml version="1.0" encoding="utf-8"?>
-<w:glossaryDocument xmlns:wpc="http://schemas.microsoft.com/office/word/2010/wordprocessingCanvas" xmlns:mc="http://schemas.openxmlformats.org/markup-compatibility/2006" xmlns:o="urn:schemas-microsoft-com:office:office" xmlns:r="http://schemas.openxmlformats.org/officeDocument/2006/relationships" xmlns:m="http://schemas.openxmlformats.org/officeDocument/2006/math" xmlns:v="urn:schemas-microsoft-com:vml" xmlns:wp14="http://schemas.microsoft.com/office/word/2010/wordprocessingDrawing" xmlns:wp="http://schemas.openxmlformats.org/drawingml/2006/wordprocessingDrawing" xmlns:w10="urn:schemas-microsoft-com:office:word" xmlns:w="http://schemas.openxmlformats.org/wordprocessingml/2006/main" xmlns:w14="http://schemas.microsoft.com/office/word/2010/wordml" xmlns:w15="http://schemas.microsoft.com/office/word/2012/wordml" xmlns:wpg="http://schemas.microsoft.com/office/word/2010/wordprocessingGroup" xmlns:wpi="http://schemas.microsoft.com/office/word/2010/wordprocessingInk" xmlns:wne="http://schemas.microsoft.com/office/word/2006/wordml" xmlns:wps="http://schemas.microsoft.com/office/word/2010/wordprocessingShape" mc:Ignorable="w14 w15 wp14"/>
-</file>
-
-<file path=word/glossary/fontTable.xml><?xml version="1.0" encoding="utf-8"?>
-<w:fonts xmlns:mc="http://schemas.openxmlformats.org/markup-compatibility/2006" xmlns:r="http://schemas.openxmlformats.org/officeDocument/2006/relationships" xmlns:w="http://schemas.openxmlformats.org/wordprocessingml/2006/main" xmlns:w14="http://schemas.microsoft.com/office/word/2010/wordml" xmlns:w15="http://schemas.microsoft.com/office/word/2012/wordml" mc:Ignorable="w14 w15">
-  <w:font w:name="Calibri">
-    <w:panose1 w:val="020F0502020204030204"/>
-    <w:charset w:val="00"/>
-    <w:family w:val="swiss"/>
-    <w:pitch w:val="variable"/>
-    <w:sig w:usb0="E4002EFF" w:usb1="C000247B" w:usb2="00000009" w:usb3="00000000" w:csb0="000001FF" w:csb1="00000000"/>
-  </w:font>
-  <w:font w:name="Times New Roman">
-    <w:panose1 w:val="02020603050405020304"/>
-    <w:charset w:val="00"/>
-    <w:family w:val="roman"/>
-    <w:pitch w:val="variable"/>
-    <w:sig w:usb0="E0002EFF" w:usb1="C000785B" w:usb2="00000009" w:usb3="00000000" w:csb0="000001FF" w:csb1="00000000"/>
-  </w:font>
-  <w:font w:name="Courier New">
-    <w:panose1 w:val="02070309020205020404"/>
-    <w:charset w:val="00"/>
-    <w:family w:val="modern"/>
-    <w:pitch w:val="fixed"/>
-    <w:sig w:usb0="E0002EFF" w:usb1="C0007843" w:usb2="00000009" w:usb3="00000000" w:csb0="000001FF" w:csb1="00000000"/>
-  </w:font>
-  <w:font w:name="Wingdings">
-    <w:panose1 w:val="05000000000000000000"/>
-    <w:charset w:val="02"/>
-    <w:family w:val="auto"/>
-    <w:pitch w:val="variable"/>
-    <w:sig w:usb0="00000000" w:usb1="10000000" w:usb2="00000000" w:usb3="00000000" w:csb0="80000000" w:csb1="00000000"/>
-  </w:font>
-  <w:font w:name="Symbol">
-    <w:panose1 w:val="05050102010706020507"/>
-    <w:charset w:val="02"/>
-    <w:family w:val="roman"/>
-    <w:pitch w:val="variable"/>
-    <w:sig w:usb0="00000000" w:usb1="10000000" w:usb2="00000000" w:usb3="00000000" w:csb0="80000000" w:csb1="00000000"/>
-  </w:font>
-  <w:font w:name="Calibri Light">
-    <w:panose1 w:val="020F0302020204030204"/>
-    <w:charset w:val="00"/>
-    <w:family w:val="swiss"/>
-    <w:pitch w:val="variable"/>
-    <w:sig w:usb0="E4002EFF" w:usb1="C000247B" w:usb2="00000009" w:usb3="00000000" w:csb0="000001FF" w:csb1="00000000"/>
-  </w:font>
-  <w:font w:name="Segoe UI">
-    <w:panose1 w:val="020B0502040204020203"/>
-    <w:charset w:val="00"/>
-    <w:family w:val="swiss"/>
-    <w:notTrueType/>
-    <w:pitch w:val="variable"/>
-    <w:sig w:usb0="00000003" w:usb1="00000000" w:usb2="00000000" w:usb3="00000000" w:csb0="00000001" w:csb1="00000000"/>
-  </w:font>
-  <w:font w:name="Century Gothic">
-    <w:panose1 w:val="020B0502020202020204"/>
-    <w:charset w:val="00"/>
-    <w:family w:val="swiss"/>
-    <w:pitch w:val="variable"/>
-    <w:sig w:usb0="00000287" w:usb1="00000000" w:usb2="00000000" w:usb3="00000000" w:csb0="0000009F" w:csb1="00000000"/>
-  </w:font>
-</w:fonts>
-</file>
-
-<file path=word/glossary/settings.xml><?xml version="1.0" encoding="utf-8"?>
-<w:settings xmlns:mc="http://schemas.openxmlformats.org/markup-compatibility/2006" xmlns:o="urn:schemas-microsoft-com:office:office" xmlns:r="http://schemas.openxmlformats.org/officeDocument/2006/relationships" xmlns:m="http://schemas.openxmlformats.org/officeDocument/2006/math" xmlns:v="urn:schemas-microsoft-com:vml" xmlns:w10="urn:schemas-microsoft-com:office:word" xmlns:w="http://schemas.openxmlformats.org/wordprocessingml/2006/main" xmlns:w14="http://schemas.microsoft.com/office/word/2010/wordml" xmlns:w15="http://schemas.microsoft.com/office/word/2012/wordml" xmlns:sl="http://schemas.openxmlformats.org/schemaLibrary/2006/main" mc:Ignorable="w14 w15">
-  <w:defaultTabStop w:val="708"/>
-  <w:hyphenationZone w:val="425"/>
-  <w:characterSpacingControl w:val="doNotCompress"/>
-  <w:compat>
-    <w:useFELayout/>
-    <w:compatSetting w:name="compatibilityMode" w:uri="http://schemas.microsoft.com/office/word" w:val="12"/>
-  </w:compat>
-  <w:rsids>
-    <w:rsidRoot w:val="00835ACF"/>
-    <w:rsid w:val="00826347"/>
-    <w:rsid w:val="00835ACF"/>
-  </w:rsids>
-  <m:mathPr>
-    <m:mathFont m:val="Cambria Math"/>
-    <m:brkBin m:val="before"/>
-    <m:brkBinSub m:val="--"/>
-    <m:smallFrac m:val="0"/>
-    <m:dispDef/>
-    <m:lMargin m:val="0"/>
-    <m:rMargin m:val="0"/>
-    <m:defJc m:val="centerGroup"/>
-    <m:wrapIndent m:val="1440"/>
-    <m:intLim m:val="subSup"/>
-    <m:naryLim m:val="undOvr"/>
-  </m:mathPr>
-  <w:themeFontLang w:val="es-CL"/>
-  <w:clrSchemeMapping w:bg1="light1" w:t1="dark1" w:bg2="light2" w:t2="dark2" w:accent1="accent1" w:accent2="accent2" w:accent3="accent3" w:accent4="accent4" w:accent5="accent5" w:accent6="accent6" w:hyperlink="hyperlink" w:followedHyperlink="followedHyperlink"/>
-  <w:decimalSymbol w:val=","/>
-  <w:listSeparator w:val=";"/>
-</w:settings>
-</file>
-
-<file path=word/glossary/styles.xml><?xml version="1.0" encoding="utf-8"?>
-<w:styles xmlns:mc="http://schemas.openxmlformats.org/markup-compatibility/2006" xmlns:r="http://schemas.openxmlformats.org/officeDocument/2006/relationships" xmlns:w="http://schemas.openxmlformats.org/wordprocessingml/2006/main" xmlns:w14="http://schemas.microsoft.com/office/word/2010/wordml" xmlns:w15="http://schemas.microsoft.com/office/word/2012/wordml" mc:Ignorable="w14 w15">
-  <w:docDefaults>
-    <w:rPrDefault>
-      <w:rPr>
-        <w:rFonts w:asciiTheme="minorHAnsi" w:eastAsiaTheme="minorEastAsia" w:hAnsiTheme="minorHAnsi" w:cstheme="minorBidi"/>
-        <w:sz w:val="22"/>
-        <w:szCs w:val="22"/>
-        <w:lang w:val="es-CL" w:eastAsia="es-CL" w:bidi="ar-SA"/>
-      </w:rPr>
-    </w:rPrDefault>
-    <w:pPrDefault>
-      <w:pPr>
-        <w:spacing w:after="160" w:line="259" w:lineRule="auto"/>
-      </w:pPr>
-    </w:pPrDefault>
-  </w:docDefaults>
-  <w:latentStyles w:defLockedState="0" w:defUIPriority="99" w:defSemiHidden="0" w:defUnhideWhenUsed="0" w:defQFormat="0" w:count="371">
-    <w:lsdException w:name="Normal" w:uiPriority="0" w:qFormat="1"/>
-    <w:lsdException w:name="heading 1" w:uiPriority="9" w:qFormat="1"/>
-    <w:lsdException w:name="heading 2" w:semiHidden="1" w:uiPriority="9" w:unhideWhenUsed="1" w:qFormat="1"/>
-    <w:lsdException w:name="heading 3" w:semiHidden="1" w:uiPriority="9" w:unhideWhenUsed="1" w:qFormat="1"/>
-    <w:lsdException w:name="heading 4" w:semiHidden="1" w:uiPriority="9" w:unhideWhenUsed="1" w:qFormat="1"/>
-    <w:lsdException w:name="heading 5" w:semiHidden="1" w:uiPriority="9" w:unhideWhenUsed="1" w:qFormat="1"/>
-    <w:lsdException w:name="heading 6" w:semiHidden="1" w:uiPriority="9" w:unhideWhenUsed="1" w:qFormat="1"/>
-    <w:lsdException w:name="heading 7" w:semiHidden="1" w:uiPriority="9" w:unhideWhenUsed="1" w:qFormat="1"/>
-    <w:lsdException w:name="heading 8" w:semiHidden="1" w:uiPriority="9" w:unhideWhenUsed="1" w:qFormat="1"/>
-    <w:lsdException w:name="heading 9" w:semiHidden="1" w:uiPriority="9" w:unhideWhenUsed="1" w:qFormat="1"/>
-    <w:lsdException w:name="index 1" w:semiHidden="1" w:unhideWhenUsed="1"/>
-    <w:lsdException w:name="index 2" w:semiHidden="1" w:unhideWhenUsed="1"/>
-    <w:lsdException w:name="index 3" w:semiHidden="1" w:unhideWhenUsed="1"/>
-    <w:lsdException w:name="index 4" w:semiHidden="1" w:unhideWhenUsed="1"/>
-    <w:lsdException w:name="index 5" w:semiHidden="1" w:unhideWhenUsed="1"/>
-    <w:lsdException w:name="index 6" w:semiHidden="1" w:unhideWhenUsed="1"/>
-    <w:lsdException w:name="index 7" w:semiHidden="1" w:unhideWhenUsed="1"/>
-    <w:lsdException w:name="index 8" w:semiHidden="1" w:unhideWhenUsed="1"/>
-    <w:lsdException w:name="index 9" w:semiHidden="1" w:unhideWhenUsed="1"/>
-    <w:lsdException w:name="toc 1" w:semiHidden="1" w:uiPriority="39" w:unhideWhenUsed="1"/>
-    <w:lsdException w:name="toc 2" w:semiHidden="1" w:uiPriority="39" w:unhideWhenUsed="1"/>
-    <w:lsdException w:name="toc 3" w:semiHidden="1" w:uiPriority="39" w:unhideWhenUsed="1"/>
-    <w:lsdException w:name="toc 4" w:semiHidden="1" w:uiPriority="39" w:unhideWhenUsed="1"/>
-    <w:lsdException w:name="toc 5" w:semiHidden="1" w:uiPriority="39" w:unhideWhenUsed="1"/>
-    <w:lsdException w:name="toc 6" w:semiHidden="1" w:uiPriority="39" w:unhideWhenUsed="1"/>
-    <w:lsdException w:name="toc 7" w:semiHidden="1" w:uiPriority="39" w:unhideWhenUsed="1"/>
-    <w:lsdException w:name="toc 8" w:semiHidden="1" w:uiPriority="39" w:unhideWhenUsed="1"/>
-    <w:lsdException w:name="toc 9" w:semiHidden="1" w:uiPriority="39" w:unhideWhenUsed="1"/>
-    <w:lsdException w:name="Normal Indent" w:semiHidden="1" w:unhideWhenUsed="1"/>
-    <w:lsdException w:name="footnote text" w:semiHidden="1" w:unhideWhenUsed="1"/>
-    <w:lsdException w:name="annotation text" w:semiHidden="1" w:unhideWhenUsed="1"/>
-    <w:lsdException w:name="header" w:semiHidden="1" w:unhideWhenUsed="1"/>
-    <w:lsdException w:name="footer" w:semiHidden="1" w:unhideWhenUsed="1"/>
-    <w:lsdException w:name="index heading" w:semiHidden="1" w:unhideWhenUsed="1"/>
-    <w:lsdException w:name="caption" w:semiHidden="1" w:uiPriority="35" w:unhideWhenUsed="1" w:qFormat="1"/>
-    <w:lsdException w:name="table of figures" w:semiHidden="1" w:unhideWhenUsed="1"/>
-    <w:lsdException w:name="envelope address" w:semiHidden="1" w:unhideWhenUsed="1"/>
-    <w:lsdException w:name="envelope return" w:semiHidden="1" w:unhideWhenUsed="1"/>
-    <w:lsdException w:name="footnote reference" w:semiHidden="1" w:unhideWhenUsed="1"/>
-    <w:lsdException w:name="annotation reference" w:semiHidden="1" w:unhideWhenUsed="1"/>
-    <w:lsdException w:name="line number" w:semiHidden="1" w:unhideWhenUsed="1"/>
-    <w:lsdException w:name="page number" w:semiHidden="1" w:unhideWhenUsed="1"/>
-    <w:lsdException w:name="endnote reference" w:semiHidden="1" w:unhideWhenUsed="1"/>
-    <w:lsdException w:name="endnote text" w:semiHidden="1" w:unhideWhenUsed="1"/>
-    <w:lsdException w:name="table of authorities" w:semiHidden="1" w:unhideWhenUsed="1"/>
-    <w:lsdException w:name="macro" w:semiHidden="1" w:unhideWhenUsed="1"/>
-    <w:lsdException w:name="toa heading" w:semiHidden="1" w:unhideWhenUsed="1"/>
-    <w:lsdException w:name="List" w:semiHidden="1" w:unhideWhenUsed="1"/>
-    <w:lsdException w:name="List Bullet" w:semiHidden="1" w:unhideWhenUsed="1"/>
-    <w:lsdException w:name="List Number" w:semiHidden="1" w:unhideWhenUsed="1"/>
-    <w:lsdException w:name="List 2" w:semiHidden="1" w:unhideWhenUsed="1"/>
-    <w:lsdException w:name="List 3" w:semiHidden="1" w:unhideWhenUsed="1"/>
-    <w:lsdException w:name="List 4" w:semiHidden="1" w:unhideWhenUsed="1"/>
-    <w:lsdException w:name="List 5" w:semiHidden="1" w:unhideWhenUsed="1"/>
-    <w:lsdException w:name="List Bullet 2" w:semiHidden="1" w:unhideWhenUsed="1"/>
-    <w:lsdException w:name="List Bullet 3" w:semiHidden="1" w:unhideWhenUsed="1"/>
-    <w:lsdException w:name="List Bullet 4" w:semiHidden="1" w:unhideWhenUsed="1"/>
-    <w:lsdException w:name="List Bullet 5" w:semiHidden="1" w:unhideWhenUsed="1"/>
-    <w:lsdException w:name="List Number 2" w:semiHidden="1" w:unhideWhenUsed="1"/>
-    <w:lsdException w:name="List Number 3" w:semiHidden="1" w:unhideWhenUsed="1"/>
-    <w:lsdException w:name="List Number 4" w:semiHidden="1" w:unhideWhenUsed="1"/>
-    <w:lsdException w:name="List Number 5" w:semiHidden="1" w:unhideWhenUsed="1"/>
-    <w:lsdException w:name="Title" w:uiPriority="10" w:qFormat="1"/>
-    <w:lsdException w:name="Closing" w:semiHidden="1" w:unhideWhenUsed="1"/>
-    <w:lsdException w:name="Signature" w:semiHidden="1" w:unhideWhenUsed="1"/>
-    <w:lsdException w:name="Default Paragraph Font" w:semiHidden="1" w:uiPriority="1" w:unhideWhenUsed="1"/>
-    <w:lsdException w:name="Body Text" w:semiHidden="1" w:unhideWhenUsed="1"/>
-    <w:lsdException w:name="Body Text Indent" w:semiHidden="1" w:unhideWhenUsed="1"/>
-    <w:lsdException w:name="List Continue" w:semiHidden="1" w:unhideWhenUsed="1"/>
-    <w:lsdException w:name="List Continue 2" w:semiHidden="1" w:unhideWhenUsed="1"/>
-    <w:lsdException w:name="List Continue 3" w:semiHidden="1" w:unhideWhenUsed="1"/>
-    <w:lsdException w:name="List Continue 4" w:semiHidden="1" w:unhideWhenUsed="1"/>
-    <w:lsdException w:name="List Continue 5" w:semiHidden="1" w:unhideWhenUsed="1"/>
-    <w:lsdException w:name="Message Header" w:semiHidden="1" w:unhideWhenUsed="1"/>
-    <w:lsdException w:name="Subtitle" w:uiPriority="11" w:qFormat="1"/>
-    <w:lsdException w:name="Salutation" w:semiHidden="1" w:unhideWhenUsed="1"/>
-    <w:lsdException w:name="Date" w:semiHidden="1" w:unhideWhenUsed="1"/>
-    <w:lsdException w:name="Body Text First Indent" w:semiHidden="1" w:unhideWhenUsed="1"/>
-    <w:lsdException w:name="Body Text First Indent 2" w:semiHidden="1" w:unhideWhenUsed="1"/>
-    <w:lsdException w:name="Note Heading" w:semiHidden="1" w:unhideWhenUsed="1"/>
-    <w:lsdException w:name="Body Text 2" w:semiHidden="1" w:unhideWhenUsed="1"/>
-    <w:lsdException w:name="Body Text 3" w:semiHidden="1" w:unhideWhenUsed="1"/>
-    <w:lsdException w:name="Body Text Indent 2" w:semiHidden="1" w:unhideWhenUsed="1"/>
-    <w:lsdException w:name="Body Text Indent 3" w:semiHidden="1" w:unhideWhenUsed="1"/>
-    <w:lsdException w:name="Block Text" w:semiHidden="1" w:unhideWhenUsed="1"/>
-    <w:lsdException w:name="Hyperlink" w:semiHidden="1" w:unhideWhenUsed="1"/>
-    <w:lsdException w:name="FollowedHyperlink" w:semiHidden="1" w:unhideWhenUsed="1"/>
-    <w:lsdException w:name="Strong" w:uiPriority="22" w:qFormat="1"/>
-    <w:lsdException w:name="Emphasis" w:uiPriority="20" w:qFormat="1"/>
-    <w:lsdException w:name="Document Map" w:semiHidden="1" w:unhideWhenUsed="1"/>
-    <w:lsdException w:name="Plain Text" w:semiHidden="1" w:unhideWhenUsed="1"/>
-    <w:lsdException w:name="E-mail Signature" w:semiHidden="1" w:unhideWhenUsed="1"/>
-    <w:lsdException w:name="HTML Top of Form" w:semiHidden="1" w:unhideWhenUsed="1"/>
-    <w:lsdException w:name="HTML Bottom of Form" w:semiHidden="1" w:unhideWhenUsed="1"/>
-    <w:lsdException w:name="Normal (Web)" w:semiHidden="1" w:unhideWhenUsed="1"/>
-    <w:lsdException w:name="HTML Acronym" w:semiHidden="1" w:unhideWhenUsed="1"/>
-    <w:lsdException w:name="HTML Address" w:semiHidden="1" w:unhideWhenUsed="1"/>
-    <w:lsdException w:name="HTML Cite" w:semiHidden="1" w:unhideWhenUsed="1"/>
-    <w:lsdException w:name="HTML Code" w:semiHidden="1" w:unhideWhenUsed="1"/>
-    <w:lsdException w:name="HTML Definition" w:semiHidden="1" w:unhideWhenUsed="1"/>
-    <w:lsdException w:name="HTML Keyboard" w:semiHidden="1" w:unhideWhenUsed="1"/>
-    <w:lsdException w:name="HTML Preformatted" w:semiHidden="1" w:unhideWhenUsed="1"/>
-    <w:lsdException w:name="HTML Sample" w:semiHidden="1" w:unhideWhenUsed="1"/>
-    <w:lsdException w:name="HTML Typewriter" w:semiHidden="1" w:unhideWhenUsed="1"/>
-    <w:lsdException w:name="HTML Variable" w:semiHidden="1" w:unhideWhenUsed="1"/>
-    <w:lsdException w:name="Normal Table" w:semiHidden="1" w:unhideWhenUsed="1"/>
-    <w:lsdException w:name="annotation subject" w:semiHidden="1" w:unhideWhenUsed="1"/>
-    <w:lsdException w:name="No List" w:semiHidden="1" w:unhideWhenUsed="1"/>
-    <w:lsdException w:name="Outline List 1" w:semiHidden="1" w:unhideWhenUsed="1"/>
-    <w:lsdException w:name="Outline List 2" w:semiHidden="1" w:unhideWhenUsed="1"/>
-    <w:lsdException w:name="Outline List 3" w:semiHidden="1" w:unhideWhenUsed="1"/>
-    <w:lsdException w:name="Table Simple 1" w:semiHidden="1" w:unhideWhenUsed="1"/>
-    <w:lsdException w:name="Table Simple 2" w:semiHidden="1" w:unhideWhenUsed="1"/>
-    <w:lsdException w:name="Table Simple 3" w:semiHidden="1" w:unhideWhenUsed="1"/>
-    <w:lsdException w:name="Table Classic 1" w:semiHidden="1" w:unhideWhenUsed="1"/>
-    <w:lsdException w:name="Table Classic 2" w:semiHidden="1" w:unhideWhenUsed="1"/>
-    <w:lsdException w:name="Table Classic 3" w:semiHidden="1" w:unhideWhenUsed="1"/>
-    <w:lsdException w:name="Table Classic 4" w:semiHidden="1" w:unhideWhenUsed="1"/>
-    <w:lsdException w:name="Table Colorful 1" w:semiHidden="1" w:unhideWhenUsed="1"/>
-    <w:lsdException w:name="Table Colorful 2" w:semiHidden="1" w:unhideWhenUsed="1"/>
-    <w:lsdException w:name="Table Colorful 3" w:semiHidden="1" w:unhideWhenUsed="1"/>
-    <w:lsdException w:name="Table Columns 1" w:semiHidden="1" w:unhideWhenUsed="1"/>
-    <w:lsdException w:name="Table Columns 2" w:semiHidden="1" w:unhideWhenUsed="1"/>
-    <w:lsdException w:name="Table Columns 3" w:semiHidden="1" w:unhideWhenUsed="1"/>
-    <w:lsdException w:name="Table Columns 4" w:semiHidden="1" w:unhideWhenUsed="1"/>
-    <w:lsdException w:name="Table Columns 5" w:semiHidden="1" w:unhideWhenUsed="1"/>
-    <w:lsdException w:name="Table Grid 1" w:semiHidden="1" w:unhideWhenUsed="1"/>
-    <w:lsdException w:name="Table Grid 2" w:semiHidden="1" w:unhideWhenUsed="1"/>
-    <w:lsdException w:name="Table Grid 3" w:semiHidden="1" w:unhideWhenUsed="1"/>
-    <w:lsdException w:name="Table Grid 4" w:semiHidden="1" w:unhideWhenUsed="1"/>
-    <w:lsdException w:name="Table Grid 5" w:semiHidden="1" w:unhideWhenUsed="1"/>
-    <w:lsdException w:name="Table Grid 6" w:semiHidden="1" w:unhideWhenUsed="1"/>
-    <w:lsdException w:name="Table Grid 7" w:semiHidden="1" w:unhideWhenUsed="1"/>
-    <w:lsdException w:name="Table Grid 8" w:semiHidden="1" w:unhideWhenUsed="1"/>
-    <w:lsdException w:name="Table List 1" w:semiHidden="1" w:unhideWhenUsed="1"/>
-    <w:lsdException w:name="Table List 2" w:semiHidden="1" w:unhideWhenUsed="1"/>
-    <w:lsdException w:name="Table List 3" w:semiHidden="1" w:unhideWhenUsed="1"/>
-    <w:lsdException w:name="Table List 4" w:semiHidden="1" w:unhideWhenUsed="1"/>
-    <w:lsdException w:name="Table List 5" w:semiHidden="1" w:unhideWhenUsed="1"/>
-    <w:lsdException w:name="Table List 6" w:semiHidden="1" w:unhideWhenUsed="1"/>
-    <w:lsdException w:name="Table List 7" w:semiHidden="1" w:unhideWhenUsed="1"/>
-    <w:lsdException w:name="Table List 8" w:semiHidden="1" w:unhideWhenUsed="1"/>
-    <w:lsdException w:name="Table 3D effects 1" w:semiHidden="1" w:unhideWhenUsed="1"/>
-    <w:lsdException w:name="Table 3D effects 2" w:semiHidden="1" w:unhideWhenUsed="1"/>
-    <w:lsdException w:name="Table 3D effects 3" w:semiHidden="1" w:unhideWhenUsed="1"/>
-    <w:lsdException w:name="Table Contemporary" w:semiHidden="1" w:unhideWhenUsed="1"/>
-    <w:lsdException w:name="Table Elegant" w:semiHidden="1" w:unhideWhenUsed="1"/>
-    <w:lsdException w:name="Table Professional" w:semiHidden="1" w:unhideWhenUsed="1"/>
-    <w:lsdException w:name="Table Subtle 1" w:semiHidden="1" w:unhideWhenUsed="1"/>
-    <w:lsdException w:name="Table Subtle 2" w:semiHidden="1" w:unhideWhenUsed="1"/>
-    <w:lsdException w:name="Table Web 1" w:semiHidden="1" w:unhideWhenUsed="1"/>
-    <w:lsdException w:name="Table Web 2" w:semiHidden="1" w:unhideWhenUsed="1"/>
-    <w:lsdException w:name="Table Web 3" w:semiHidden="1" w:unhideWhenUsed="1"/>
-    <w:lsdException w:name="Balloon Text" w:semiHidden="1" w:unhideWhenUsed="1"/>
-    <w:lsdException w:name="Table Grid" w:uiPriority="39"/>
-    <w:lsdException w:name="Table Theme" w:semiHidden="1" w:unhideWhenUsed="1"/>
-    <w:lsdException w:name="Placeholder Text" w:semiHidden="1"/>
-    <w:lsdException w:name="No Spacing" w:uiPriority="1" w:qFormat="1"/>
-    <w:lsdException w:name="Light Shading" w:uiPriority="60"/>
-    <w:lsdException w:name="Light List" w:uiPriority="61"/>
-    <w:lsdException w:name="Light Grid" w:uiPriority="62"/>
-    <w:lsdException w:name="Medium Shading 1" w:uiPriority="63"/>
-    <w:lsdException w:name="Medium Shading 2" w:uiPriority="64"/>
-    <w:lsdException w:name="Medium List 1" w:uiPriority="65"/>
-    <w:lsdException w:name="Medium List 2" w:uiPriority="66"/>
-    <w:lsdException w:name="Medium Grid 1" w:uiPriority="67"/>
-    <w:lsdException w:name="Medium Grid 2" w:uiPriority="68"/>
-    <w:lsdException w:name="Medium Grid 3" w:uiPriority="69"/>
-    <w:lsdException w:name="Dark List" w:uiPriority="70"/>
-    <w:lsdException w:name="Colorful Shading" w:uiPriority="71"/>
-    <w:lsdException w:name="Colorful List" w:uiPriority="72"/>
-    <w:lsdException w:name="Colorful Grid" w:uiPriority="73"/>
-    <w:lsdException w:name="Light Shading Accent 1" w:uiPriority="60"/>
-    <w:lsdException w:name="Light List Accent 1" w:uiPriority="61"/>
-    <w:lsdException w:name="Light Grid Accent 1" w:uiPriority="62"/>
-    <w:lsdException w:name="Medium Shading 1 Accent 1" w:uiPriority="63"/>
-    <w:lsdException w:name="Medium Shading 2 Accent 1" w:uiPriority="64"/>
-    <w:lsdException w:name="Medium List 1 Accent 1" w:uiPriority="65"/>
-    <w:lsdException w:name="Revision" w:semiHidden="1"/>
-    <w:lsdException w:name="List Paragraph" w:uiPriority="34" w:qFormat="1"/>
-    <w:lsdException w:name="Quote" w:uiPriority="29" w:qFormat="1"/>
-    <w:lsdException w:name="Intense Quote" w:uiPriority="30" w:qFormat="1"/>
-    <w:lsdException w:name="Medium List 2 Accent 1" w:uiPriority="66"/>
-    <w:lsdException w:name="Medium Grid 1 Accent 1" w:uiPriority="67"/>
-    <w:lsdException w:name="Medium Grid 2 Accent 1" w:uiPriority="68"/>
-    <w:lsdException w:name="Medium Grid 3 Accent 1" w:uiPriority="69"/>
-    <w:lsdException w:name="Dark List Accent 1" w:uiPriority="70"/>
-    <w:lsdException w:name="Colorful Shading Accent 1" w:uiPriority="71"/>
-    <w:lsdException w:name="Colorful List Accent 1" w:uiPriority="72"/>
-    <w:lsdException w:name="Colorful Grid Accent 1" w:uiPriority="73"/>
-    <w:lsdException w:name="Light Shading Accent 2" w:uiPriority="60"/>
-    <w:lsdException w:name="Light List Accent 2" w:uiPriority="61"/>
-    <w:lsdException w:name="Light Grid Accent 2" w:uiPriority="62"/>
-    <w:lsdException w:name="Medium Shading 1 Accent 2" w:uiPriority="63"/>
-    <w:lsdException w:name="Medium Shading 2 Accent 2" w:uiPriority="64"/>
-    <w:lsdException w:name="Medium List 1 Accent 2" w:uiPriority="65"/>
-    <w:lsdException w:name="Medium List 2 Accent 2" w:uiPriority="66"/>
-    <w:lsdException w:name="Medium Grid 1 Accent 2" w:uiPriority="67"/>
-    <w:lsdException w:name="Medium Grid 2 Accent 2" w:uiPriority="68"/>
-    <w:lsdException w:name="Medium Grid 3 Accent 2" w:uiPriority="69"/>
-    <w:lsdException w:name="Dark List Accent 2" w:uiPriority="70"/>
-    <w:lsdException w:name="Colorful Shading Accent 2" w:uiPriority="71"/>
-    <w:lsdException w:name="Colorful List Accent 2" w:uiPriority="72"/>
-    <w:lsdException w:name="Colorful Grid Accent 2" w:uiPriority="73"/>
-    <w:lsdException w:name="Light Shading Accent 3" w:uiPriority="60"/>
-    <w:lsdException w:name="Light List Accent 3" w:uiPriority="61"/>
-    <w:lsdException w:name="Light Grid Accent 3" w:uiPriority="62"/>
-    <w:lsdException w:name="Medium Shading 1 Accent 3" w:uiPriority="63"/>
-    <w:lsdException w:name="Medium Shading 2 Accent 3" w:uiPriority="64"/>
-    <w:lsdException w:name="Medium List 1 Accent 3" w:uiPriority="65"/>
-    <w:lsdException w:name="Medium List 2 Accent 3" w:uiPriority="66"/>
-    <w:lsdException w:name="Medium Grid 1 Accent 3" w:uiPriority="67"/>
-    <w:lsdException w:name="Medium Grid 2 Accent 3" w:uiPriority="68"/>
-    <w:lsdException w:name="Medium Grid 3 Accent 3" w:uiPriority="69"/>
-    <w:lsdException w:name="Dark List Accent 3" w:uiPriority="70"/>
-    <w:lsdException w:name="Colorful Shading Accent 3" w:uiPriority="71"/>
-    <w:lsdException w:name="Colorful List Accent 3" w:uiPriority="72"/>
-    <w:lsdException w:name="Colorful Grid Accent 3" w:uiPriority="73"/>
-    <w:lsdException w:name="Light Shading Accent 4" w:uiPriority="60"/>
-    <w:lsdException w:name="Light List Accent 4" w:uiPriority="61"/>
-    <w:lsdException w:name="Light Grid Accent 4" w:uiPriority="62"/>
-    <w:lsdException w:name="Medium Shading 1 Accent 4" w:uiPriority="63"/>
-    <w:lsdException w:name="Medium Shading 2 Accent 4" w:uiPriority="64"/>
-    <w:lsdException w:name="Medium List 1 Accent 4" w:uiPriority="65"/>
-    <w:lsdException w:name="Medium List 2 Accent 4" w:uiPriority="66"/>
-    <w:lsdException w:name="Medium Grid 1 Accent 4" w:uiPriority="67"/>
-    <w:lsdException w:name="Medium Grid 2 Accent 4" w:uiPriority="68"/>
-    <w:lsdException w:name="Medium Grid 3 Accent 4" w:uiPriority="69"/>
-    <w:lsdException w:name="Dark List Accent 4" w:uiPriority="70"/>
-    <w:lsdException w:name="Colorful Shading Accent 4" w:uiPriority="71"/>
-    <w:lsdException w:name="Colorful List Accent 4" w:uiPriority="72"/>
-    <w:lsdException w:name="Colorful Grid Accent 4" w:uiPriority="73"/>
-    <w:lsdException w:name="Light Shading Accent 5" w:uiPriority="60"/>
-    <w:lsdException w:name="Light List Accent 5" w:uiPriority="61"/>
-    <w:lsdException w:name="Light Grid Accent 5" w:uiPriority="62"/>
-    <w:lsdException w:name="Medium Shading 1 Accent 5" w:uiPriority="63"/>
-    <w:lsdException w:name="Medium Shading 2 Accent 5" w:uiPriority="64"/>
-    <w:lsdException w:name="Medium List 1 Accent 5" w:uiPriority="65"/>
-    <w:lsdException w:name="Medium List 2 Accent 5" w:uiPriority="66"/>
-    <w:lsdException w:name="Medium Grid 1 Accent 5" w:uiPriority="67"/>
-    <w:lsdException w:name="Medium Grid 2 Accent 5" w:uiPriority="68"/>
-    <w:lsdException w:name="Medium Grid 3 Accent 5" w:uiPriority="69"/>
-    <w:lsdException w:name="Dark List Accent 5" w:uiPriority="70"/>
-    <w:lsdException w:name="Colorful Shading Accent 5" w:uiPriority="71"/>
-    <w:lsdException w:name="Colorful List Accent 5" w:uiPriority="72"/>
-    <w:lsdException w:name="Colorful Grid Accent 5" w:uiPriority="73"/>
-    <w:lsdException w:name="Light Shading Accent 6" w:uiPriority="60"/>
-    <w:lsdException w:name="Light List Accent 6" w:uiPriority="61"/>
-    <w:lsdException w:name="Light Grid Accent 6" w:uiPriority="62"/>
-    <w:lsdException w:name="Medium Shading 1 Accent 6" w:uiPriority="63"/>
-    <w:lsdException w:name="Medium Shading 2 Accent 6" w:uiPriority="64"/>
-    <w:lsdException w:name="Medium List 1 Accent 6" w:uiPriority="65"/>
-    <w:lsdException w:name="Medium List 2 Accent 6" w:uiPriority="66"/>
-    <w:lsdException w:name="Medium Grid 1 Accent 6" w:uiPriority="67"/>
-    <w:lsdException w:name="Medium Grid 2 Accent 6" w:uiPriority="68"/>
-    <w:lsdException w:name="Medium Grid 3 Accent 6" w:uiPriority="69"/>
-    <w:lsdException w:name="Dark List Accent 6" w:uiPriority="70"/>
-    <w:lsdException w:name="Colorful Shading Accent 6" w:uiPriority="71"/>
-    <w:lsdException w:name="Colorful List Accent 6" w:uiPriority="72"/>
-    <w:lsdException w:name="Colorful Grid Accent 6" w:uiPriority="73"/>
-    <w:lsdException w:name="Subtle Emphasis" w:uiPriority="19" w:qFormat="1"/>
-    <w:lsdException w:name="Intense Emphasis" w:uiPriority="21" w:qFormat="1"/>
-    <w:lsdException w:name="Subtle Reference" w:uiPriority="31" w:qFormat="1"/>
-    <w:lsdException w:name="Intense Reference" w:uiPriority="32" w:qFormat="1"/>
-    <w:lsdException w:name="Book Title" w:uiPriority="33" w:qFormat="1"/>
-    <w:lsdException w:name="Bibliography" w:semiHidden="1" w:uiPriority="37" w:unhideWhenUsed="1"/>
-    <w:lsdException w:name="TOC Heading" w:semiHidden="1" w:uiPriority="39" w:unhideWhenUsed="1" w:qFormat="1"/>
-    <w:lsdException w:name="Plain Table 1" w:uiPriority="41"/>
-    <w:lsdException w:name="Plain Table 2" w:uiPriority="42"/>
-    <w:lsdException w:name="Plain Table 3" w:uiPriority="43"/>
-    <w:lsdException w:name="Plain Table 4" w:uiPriority="44"/>
-    <w:lsdException w:name="Plain Table 5" w:uiPriority="45"/>
-    <w:lsdException w:name="Grid Table Light" w:uiPriority="40"/>
-    <w:lsdException w:name="Grid Table 1 Light" w:uiPriority="46"/>
-    <w:lsdException w:name="Grid Table 2" w:uiPriority="47"/>
-    <w:lsdException w:name="Grid Table 3" w:uiPriority="48"/>
-    <w:lsdException w:name="Grid Table 4" w:uiPriority="49"/>
-    <w:lsdException w:name="Grid Table 5 Dark" w:uiPriority="50"/>
-    <w:lsdException w:name="Grid Table 6 Colorful" w:uiPriority="51"/>
-    <w:lsdException w:name="Grid Table 7 Colorful" w:uiPriority="52"/>
-    <w:lsdException w:name="Grid Table 1 Light Accent 1" w:uiPriority="46"/>
-    <w:lsdException w:name="Grid Table 2 Accent 1" w:uiPriority="47"/>
-    <w:lsdException w:name="Grid Table 3 Accent 1" w:uiPriority="48"/>
-    <w:lsdException w:name="Grid Table 4 Accent 1" w:uiPriority="49"/>
-    <w:lsdException w:name="Grid Table 5 Dark Accent 1" w:uiPriority="50"/>
-    <w:lsdException w:name="Grid Table 6 Colorful Accent 1" w:uiPriority="51"/>
-    <w:lsdException w:name="Grid Table 7 Colorful Accent 1" w:uiPriority="52"/>
-    <w:lsdException w:name="Grid Table 1 Light Accent 2" w:uiPriority="46"/>
-    <w:lsdException w:name="Grid Table 2 Accent 2" w:uiPriority="47"/>
-    <w:lsdException w:name="Grid Table 3 Accent 2" w:uiPriority="48"/>
-    <w:lsdException w:name="Grid Table 4 Accent 2" w:uiPriority="49"/>
-    <w:lsdException w:name="Grid Table 5 Dark Accent 2" w:uiPriority="50"/>
-    <w:lsdException w:name="Grid Table 6 Colorful Accent 2" w:uiPriority="51"/>
-    <w:lsdException w:name="Grid Table 7 Colorful Accent 2" w:uiPriority="52"/>
-    <w:lsdException w:name="Grid Table 1 Light Accent 3" w:uiPriority="46"/>
-    <w:lsdException w:name="Grid Table 2 Accent 3" w:uiPriority="47"/>
-    <w:lsdException w:name="Grid Table 3 Accent 3" w:uiPriority="48"/>
-    <w:lsdException w:name="Grid Table 4 Accent 3" w:uiPriority="49"/>
-    <w:lsdException w:name="Grid Table 5 Dark Accent 3" w:uiPriority="50"/>
-    <w:lsdException w:name="Grid Table 6 Colorful Accent 3" w:uiPriority="51"/>
-    <w:lsdException w:name="Grid Table 7 Colorful Accent 3" w:uiPriority="52"/>
-    <w:lsdException w:name="Grid Table 1 Light Accent 4" w:uiPriority="46"/>
-    <w:lsdException w:name="Grid Table 2 Accent 4" w:uiPriority="47"/>
-    <w:lsdException w:name="Grid Table 3 Accent 4" w:uiPriority="48"/>
-    <w:lsdException w:name="Grid Table 4 Accent 4" w:uiPriority="49"/>
-    <w:lsdException w:name="Grid Table 5 Dark Accent 4" w:uiPriority="50"/>
-    <w:lsdException w:name="Grid Table 6 Colorful Accent 4" w:uiPriority="51"/>
-    <w:lsdException w:name="Grid Table 7 Colorful Accent 4" w:uiPriority="52"/>
-    <w:lsdException w:name="Grid Table 1 Light Accent 5" w:uiPriority="46"/>
-    <w:lsdException w:name="Grid Table 2 Accent 5" w:uiPriority="47"/>
-    <w:lsdException w:name="Grid Table 3 Accent 5" w:uiPriority="48"/>
-    <w:lsdException w:name="Grid Table 4 Accent 5" w:uiPriority="49"/>
-    <w:lsdException w:name="Grid Table 5 Dark Accent 5" w:uiPriority="50"/>
-    <w:lsdException w:name="Grid Table 6 Colorful Accent 5" w:uiPriority="51"/>
-    <w:lsdException w:name="Grid Table 7 Colorful Accent 5" w:uiPriority="52"/>
-    <w:lsdException w:name="Grid Table 1 Light Accent 6" w:uiPriority="46"/>
-    <w:lsdException w:name="Grid Table 2 Accent 6" w:uiPriority="47"/>
-    <w:lsdException w:name="Grid Table 3 Accent 6" w:uiPriority="48"/>
-    <w:lsdException w:name="Grid Table 4 Accent 6" w:uiPriority="49"/>
-    <w:lsdException w:name="Grid Table 5 Dark Accent 6" w:uiPriority="50"/>
-    <w:lsdException w:name="Grid Table 6 Colorful Accent 6" w:uiPriority="51"/>
-    <w:lsdException w:name="Grid Table 7 Colorful Accent 6" w:uiPriority="52"/>
-    <w:lsdException w:name="List Table 1 Light" w:uiPriority="46"/>
-    <w:lsdException w:name="List Table 2" w:uiPriority="47"/>
-    <w:lsdException w:name="List Table 3" w:uiPriority="48"/>
-    <w:lsdException w:name="List Table 4" w:uiPriority="49"/>
-    <w:lsdException w:name="List Table 5 Dark" w:uiPriority="50"/>
-    <w:lsdException w:name="List Table 6 Colorful" w:uiPriority="51"/>
-    <w:lsdException w:name="List Table 7 Colorful" w:uiPriority="52"/>
-    <w:lsdException w:name="List Table 1 Light Accent 1" w:uiPriority="46"/>
-    <w:lsdException w:name="List Table 2 Accent 1" w:uiPriority="47"/>
-    <w:lsdException w:name="List Table 3 Accent 1" w:uiPriority="48"/>
-    <w:lsdException w:name="List Table 4 Accent 1" w:uiPriority="49"/>
-    <w:lsdException w:name="List Table 5 Dark Accent 1" w:uiPriority="50"/>
-    <w:lsdException w:name="List Table 6 Colorful Accent 1" w:uiPriority="51"/>
-    <w:lsdException w:name="List Table 7 Colorful Accent 1" w:uiPriority="52"/>
-    <w:lsdException w:name="List Table 1 Light Accent 2" w:uiPriority="46"/>
-    <w:lsdException w:name="List Table 2 Accent 2" w:uiPriority="47"/>
-    <w:lsdException w:name="List Table 3 Accent 2" w:uiPriority="48"/>
-    <w:lsdException w:name="List Table 4 Accent 2" w:uiPriority="49"/>
-    <w:lsdException w:name="List Table 5 Dark Accent 2" w:uiPriority="50"/>
-    <w:lsdException w:name="List Table 6 Colorful Accent 2" w:uiPriority="51"/>
-    <w:lsdException w:name="List Table 7 Colorful Accent 2" w:uiPriority="52"/>
-    <w:lsdException w:name="List Table 1 Light Accent 3" w:uiPriority="46"/>
-    <w:lsdException w:name="List Table 2 Accent 3" w:uiPriority="47"/>
-    <w:lsdException w:name="List Table 3 Accent 3" w:uiPriority="48"/>
-    <w:lsdException w:name="List Table 4 Accent 3" w:uiPriority="49"/>
-    <w:lsdException w:name="List Table 5 Dark Accent 3" w:uiPriority="50"/>
-    <w:lsdException w:name="List Table 6 Colorful Accent 3" w:uiPriority="51"/>
-    <w:lsdException w:name="List Table 7 Colorful Accent 3" w:uiPriority="52"/>
-    <w:lsdException w:name="List Table 1 Light Accent 4" w:uiPriority="46"/>
-    <w:lsdException w:name="List Table 2 Accent 4" w:uiPriority="47"/>
-    <w:lsdException w:name="List Table 3 Accent 4" w:uiPriority="48"/>
-    <w:lsdException w:name="List Table 4 Accent 4" w:uiPriority="49"/>
-    <w:lsdException w:name="List Table 5 Dark Accent 4" w:uiPriority="50"/>
-    <w:lsdException w:name="List Table 6 Colorful Accent 4" w:uiPriority="51"/>
-    <w:lsdException w:name="List Table 7 Colorful Accent 4" w:uiPriority="52"/>
-    <w:lsdException w:name="List Table 1 Light Accent 5" w:uiPriority="46"/>
-    <w:lsdException w:name="List Table 2 Accent 5" w:uiPriority="47"/>
-    <w:lsdException w:name="List Table 3 Accent 5" w:uiPriority="48"/>
-    <w:lsdException w:name="List Table 4 Accent 5" w:uiPriority="49"/>
-    <w:lsdException w:name="List Table 5 Dark Accent 5" w:uiPriority="50"/>
-    <w:lsdException w:name="List Table 6 Colorful Accent 5" w:uiPriority="51"/>
-    <w:lsdException w:name="List Table 7 Colorful Accent 5" w:uiPriority="52"/>
-    <w:lsdException w:name="List Table 1 Light Accent 6" w:uiPriority="46"/>
-    <w:lsdException w:name="List Table 2 Accent 6" w:uiPriority="47"/>
-    <w:lsdException w:name="List Table 3 Accent 6" w:uiPriority="48"/>
-    <w:lsdException w:name="List Table 4 Accent 6" w:uiPriority="49"/>
-    <w:lsdException w:name="List Table 5 Dark Accent 6" w:uiPriority="50"/>
-    <w:lsdException w:name="List Table 6 Colorful Accent 6" w:uiPriority="51"/>
-    <w:lsdException w:name="List Table 7 Colorful Accent 6" w:uiPriority="52"/>
-  </w:latentStyles>
-  <w:style w:type="paragraph" w:default="1" w:styleId="Normal">
-    <w:name w:val="Normal"/>
-    <w:qFormat/>
-  </w:style>
-  <w:style w:type="character" w:default="1" w:styleId="Fuentedeprrafopredeter">
-    <w:name w:val="Default Paragraph Font"/>
-    <w:uiPriority w:val="1"/>
-    <w:semiHidden/>
-    <w:unhideWhenUsed/>
-  </w:style>
-  <w:style w:type="table" w:default="1" w:styleId="Tablanormal">
-    <w:name w:val="Normal Table"/>
-    <w:uiPriority w:val="99"/>
-    <w:semiHidden/>
-    <w:unhideWhenUsed/>
-    <w:tblPr>
-      <w:tblInd w:w="0" w:type="dxa"/>
-      <w:tblCellMar>
-        <w:top w:w="0" w:type="dxa"/>
-        <w:left w:w="108" w:type="dxa"/>
-        <w:bottom w:w="0" w:type="dxa"/>
-        <w:right w:w="108" w:type="dxa"/>
-      </w:tblCellMar>
-    </w:tblPr>
-  </w:style>
-  <w:style w:type="numbering" w:default="1" w:styleId="Sinlista">
-    <w:name w:val="No List"/>
-    <w:uiPriority w:val="99"/>
-    <w:semiHidden/>
-    <w:unhideWhenUsed/>
-  </w:style>
-</w:styles>
-</file>
-
-<file path=word/glossary/webSettings.xml><?xml version="1.0" encoding="utf-8"?>
-<w:webSettings xmlns:mc="http://schemas.openxmlformats.org/markup-compatibility/2006" xmlns:r="http://schemas.openxmlformats.org/officeDocument/2006/relationships" xmlns:w="http://schemas.openxmlformats.org/wordprocessingml/2006/main" xmlns:w14="http://schemas.microsoft.com/office/word/2010/wordml" xmlns:w15="http://schemas.microsoft.com/office/word/2012/wordml" mc:Ignorable="w14 w15"/>
-</file>
-
 <file path=word/theme/theme1.xml><?xml version="1.0" encoding="utf-8"?>
 <a:theme xmlns:a="http://schemas.openxmlformats.org/drawingml/2006/main" name="Tema de Office">
   <a:themeElements>
@@ -9880,15 +9312,6 @@
 </file>
 
 <file path=customXml/item2.xml><?xml version="1.0" encoding="utf-8"?>
-<?mso-contentType ?>
-<FormTemplates xmlns="http://schemas.microsoft.com/sharepoint/v3/contenttype/forms">
-  <Display>DocumentLibraryForm</Display>
-  <Edit>DocumentLibraryForm</Edit>
-  <New>DocumentLibraryForm</New>
-</FormTemplates>
-</file>
-
-<file path=customXml/item3.xml><?xml version="1.0" encoding="utf-8"?>
 <ct:contentTypeSchema xmlns:ct="http://schemas.microsoft.com/office/2006/metadata/contentType" xmlns:ma="http://schemas.microsoft.com/office/2006/metadata/properties/metaAttributes" ct:_="" ma:_="" ma:contentTypeName="Documento" ma:contentTypeID="0x010100E96778489EE7714D8BD12CC105EB918B" ma:contentTypeVersion="2" ma:contentTypeDescription="Crear nuevo documento." ma:contentTypeScope="" ma:versionID="416c5c7ae9b5d54d83875cd3c65194e3">
   <xsd:schema xmlns:xsd="http://www.w3.org/2001/XMLSchema" xmlns:xs="http://www.w3.org/2001/XMLSchema" xmlns:p="http://schemas.microsoft.com/office/2006/metadata/properties" xmlns:ns2="126e8a1c-9ea9-435a-ac89-d06c80d62e30" targetNamespace="http://schemas.microsoft.com/office/2006/metadata/properties" ma:root="true" ma:fieldsID="70a237c842677bd850644f8595079f5e" ns2:_="">
     <xsd:import namespace="126e8a1c-9ea9-435a-ac89-d06c80d62e30"/>
@@ -10020,6 +9443,15 @@
 </ct:contentTypeSchema>
 </file>
 
+<file path=customXml/item3.xml><?xml version="1.0" encoding="utf-8"?>
+<?mso-contentType ?>
+<FormTemplates xmlns="http://schemas.microsoft.com/sharepoint/v3/contenttype/forms">
+  <Display>DocumentLibraryForm</Display>
+  <Edit>DocumentLibraryForm</Edit>
+  <New>DocumentLibraryForm</New>
+</FormTemplates>
+</file>
+
 <file path=customXml/item4.xml><?xml version="1.0" encoding="utf-8"?>
 <b:Sources xmlns:b="http://schemas.openxmlformats.org/officeDocument/2006/bibliography" xmlns="http://schemas.openxmlformats.org/officeDocument/2006/bibliography" SelectedStyle="\APASixthEditionOfficeOnline.xsl" StyleName="APA" Version="6"/>
 </file>
@@ -10034,14 +9466,6 @@
 </file>
 
 <file path=customXml/itemProps2.xml><?xml version="1.0" encoding="utf-8"?>
-<ds:datastoreItem xmlns:ds="http://schemas.openxmlformats.org/officeDocument/2006/customXml" ds:itemID="{DABAA964-10BA-4DBC-ABF2-CDEAC0FAF7AA}">
-  <ds:schemaRefs>
-    <ds:schemaRef ds:uri="http://schemas.microsoft.com/sharepoint/v3/contenttype/forms"/>
-  </ds:schemaRefs>
-</ds:datastoreItem>
-</file>
-
-<file path=customXml/itemProps3.xml><?xml version="1.0" encoding="utf-8"?>
 <ds:datastoreItem xmlns:ds="http://schemas.openxmlformats.org/officeDocument/2006/customXml" ds:itemID="{767CD2D5-7A6C-47C3-9B54-C4225C74DD0B}">
   <ds:schemaRefs>
     <ds:schemaRef ds:uri="http://schemas.microsoft.com/office/2006/metadata/contentType"/>
@@ -10059,8 +9483,16 @@
 </ds:datastoreItem>
 </file>
 
+<file path=customXml/itemProps3.xml><?xml version="1.0" encoding="utf-8"?>
+<ds:datastoreItem xmlns:ds="http://schemas.openxmlformats.org/officeDocument/2006/customXml" ds:itemID="{DABAA964-10BA-4DBC-ABF2-CDEAC0FAF7AA}">
+  <ds:schemaRefs>
+    <ds:schemaRef ds:uri="http://schemas.microsoft.com/sharepoint/v3/contenttype/forms"/>
+  </ds:schemaRefs>
+</ds:datastoreItem>
+</file>
+
 <file path=customXml/itemProps4.xml><?xml version="1.0" encoding="utf-8"?>
-<ds:datastoreItem xmlns:ds="http://schemas.openxmlformats.org/officeDocument/2006/customXml" ds:itemID="{D72DA107-F97F-43BB-A188-5A7C93E08871}">
+<ds:datastoreItem xmlns:ds="http://schemas.openxmlformats.org/officeDocument/2006/customXml" ds:itemID="{E7FB4F08-BAE9-4F29-8B7E-A37D13008FB5}">
   <ds:schemaRefs>
     <ds:schemaRef ds:uri="http://schemas.openxmlformats.org/officeDocument/2006/bibliography"/>
   </ds:schemaRefs>

</xml_diff>